<commit_message>
docs: create initial semanarios documentation and schedules for September 2026.
</commit_message>
<xml_diff>
--- a/docs/semanarios/2026-09/resumo-materiais-e-impressoes-2026-09.docx
+++ b/docs/semanarios/2026-09/resumo-materiais-e-impressoes-2026-09.docx
@@ -2,7 +2,7 @@
 <file path=word/document.xml><?xml version="1.0" encoding="utf-8"?>
 <w:document xmlns:w="http://schemas.openxmlformats.org/wordprocessingml/2006/main" xmlns:m="http://schemas.openxmlformats.org/officeDocument/2006/math" xmlns:r="http://schemas.openxmlformats.org/officeDocument/2006/relationships" xmlns:o="urn:schemas-microsoft-com:office:office" xmlns:v="urn:schemas-microsoft-com:vml" xmlns:w10="urn:schemas-microsoft-com:office:word" xmlns:a="http://schemas.openxmlformats.org/drawingml/2006/main" xmlns:pic="http://schemas.openxmlformats.org/drawingml/2006/picture" xmlns:wp="http://schemas.openxmlformats.org/drawingml/2006/wordprocessingDrawing">
   <w:body>
-    <w:bookmarkStart w:id="18" w:name="Xfc5e3ac1bcba7dbd7667f762944acf8ca5511fc"/>
+    <w:bookmarkStart w:id="20" w:name="Xfc5e3ac1bcba7dbd7667f762944acf8ca5511fc"/>
     <w:p>
       <w:pPr>
         <w:pStyle w:val="Heading1"/>
@@ -42,7 +42,161 @@
       </w:r>
     </w:p>
     <w:bookmarkEnd w:id="9"/>
-    <w:bookmarkStart w:id="10" w:name="impressão-antecipada-consolidada"/>
+    <w:bookmarkStart w:id="11" w:name="tempo-reservado-para-o-preparo"/>
+    <w:p>
+      <w:pPr>
+        <w:pStyle w:val="Heading2"/>
+      </w:pPr>
+      <w:r>
+        <w:t xml:space="preserve">Tempo reservado para o preparo</w:t>
+      </w:r>
+    </w:p>
+    <w:tbl>
+      <w:tblPr>
+        <w:tblStyle w:val="Table"/>
+        <w:tblW w:type="auto" w:w="0"/>
+        <w:tblLook w:firstRow="1" w:lastRow="0" w:firstColumn="0" w:lastColumn="0" w:noHBand="0" w:noVBand="0" w:val="0020"/>
+      </w:tblPr>
+      <w:tblGrid>
+        <w:gridCol w:w="3960"/>
+        <w:gridCol w:w="3960"/>
+      </w:tblGrid>
+      <w:tr>
+        <w:trPr>
+          <w:tblHeader w:val="on"/>
+        </w:trPr>
+        <w:tc>
+          <w:tcPr/>
+          <w:p>
+            <w:pPr>
+              <w:pStyle w:val="Compact"/>
+            </w:pPr>
+            <w:r>
+              <w:t xml:space="preserve">Componente</w:t>
+            </w:r>
+          </w:p>
+        </w:tc>
+        <w:tc>
+          <w:tcPr/>
+          <w:p>
+            <w:pPr>
+              <w:pStyle w:val="Compact"/>
+              <w:jc w:val="right"/>
+            </w:pPr>
+            <w:r>
+              <w:t xml:space="preserve">Previsão semanal</w:t>
+            </w:r>
+          </w:p>
+        </w:tc>
+      </w:tr>
+      <w:tr>
+        <w:tc>
+          <w:tcPr/>
+          <w:p>
+            <w:pPr>
+              <w:pStyle w:val="Compact"/>
+            </w:pPr>
+            <w:r>
+              <w:t xml:space="preserve">Preparar uma aula única de cada série (1º ao 5º)</w:t>
+            </w:r>
+          </w:p>
+        </w:tc>
+        <w:tc>
+          <w:tcPr/>
+          <w:p>
+            <w:pPr>
+              <w:pStyle w:val="Compact"/>
+              <w:jc w:val="right"/>
+            </w:pPr>
+            <w:r>
+              <w:t xml:space="preserve">5 h</w:t>
+            </w:r>
+          </w:p>
+        </w:tc>
+      </w:tr>
+      <w:tr>
+        <w:tc>
+          <w:tcPr/>
+          <w:p>
+            <w:pPr>
+              <w:pStyle w:val="Compact"/>
+            </w:pPr>
+            <w:r>
+              <w:t xml:space="preserve">Margem para montagem/teste de robôs, impressão e ajustes</w:t>
+            </w:r>
+          </w:p>
+        </w:tc>
+        <w:tc>
+          <w:tcPr/>
+          <w:p>
+            <w:pPr>
+              <w:pStyle w:val="Compact"/>
+              <w:jc w:val="right"/>
+            </w:pPr>
+            <w:r>
+              <w:t xml:space="preserve">1 h</w:t>
+            </w:r>
+          </w:p>
+        </w:tc>
+      </w:tr>
+      <w:tr>
+        <w:tc>
+          <w:tcPr/>
+          <w:p>
+            <w:pPr>
+              <w:pStyle w:val="Compact"/>
+            </w:pPr>
+            <w:r>
+              <w:rPr>
+                <w:b/>
+                <w:bCs/>
+              </w:rPr>
+              <w:t xml:space="preserve">Reserva recomendada</w:t>
+            </w:r>
+          </w:p>
+        </w:tc>
+        <w:tc>
+          <w:tcPr/>
+          <w:p>
+            <w:pPr>
+              <w:pStyle w:val="Compact"/>
+              <w:jc w:val="right"/>
+            </w:pPr>
+            <w:r>
+              <w:rPr>
+                <w:b/>
+                <w:bCs/>
+              </w:rPr>
+              <w:t xml:space="preserve">6 h</w:t>
+            </w:r>
+          </w:p>
+        </w:tc>
+      </w:tr>
+    </w:tbl>
+    <w:p>
+      <w:pPr>
+        <w:pStyle w:val="BodyText"/>
+      </w:pPr>
+      <w:r>
+        <w:t xml:space="preserve">O cálculo considera o preparo compartilhado entre Rafael e Ricardo. A estimativa acumulada até 15/12 é de 72 horas; detalhes em</w:t>
+      </w:r>
+      <w:r>
+        <w:t xml:space="preserve"> </w:t>
+      </w:r>
+      <w:hyperlink r:id="rId10">
+        <w:r>
+          <w:rPr>
+            <w:rStyle w:val="VerbatimChar"/>
+          </w:rPr>
+          <w:t xml:space="preserve">docs/simulacoes/preparo-de-aulas-set-dez-2026.md</w:t>
+        </w:r>
+      </w:hyperlink>
+      <w:r>
+        <w:t xml:space="preserve">.</w:t>
+      </w:r>
+    </w:p>
+    <w:bookmarkEnd w:id="11"/>
+    <w:bookmarkStart w:id="12" w:name="impressão-antecipada-consolidada"/>
     <w:p>
       <w:pPr>
         <w:pStyle w:val="Heading2"/>
@@ -197,8 +351,8 @@
         <w:t xml:space="preserve">A ficha do camaleão deve ser impressa em uma única tiragem de 63 cópias. As primeiras turmas a usar são 3ºD (08/09), 3ºB (10/09) e 3ºA (11/09); o saldo de 15 cópias fica separado para o 3ºC (15/09).</w:t>
       </w:r>
     </w:p>
-    <w:bookmarkEnd w:id="10"/>
-    <w:bookmarkStart w:id="11" w:name="quantidade-de-alunos-por-turma"/>
+    <w:bookmarkEnd w:id="12"/>
+    <w:bookmarkStart w:id="13" w:name="quantidade-de-alunos-por-turma"/>
     <w:p>
       <w:pPr>
         <w:pStyle w:val="Heading2"/>
@@ -482,8 +636,8 @@
         </w:tc>
       </w:tr>
     </w:tbl>
-    <w:bookmarkEnd w:id="11"/>
-    <w:bookmarkStart w:id="16" w:name="materiais-por-semana"/>
+    <w:bookmarkEnd w:id="13"/>
+    <w:bookmarkStart w:id="18" w:name="materiais-por-semana"/>
     <w:p>
       <w:pPr>
         <w:pStyle w:val="Heading2"/>
@@ -492,7 +646,7 @@
         <w:t xml:space="preserve">Materiais por semana</w:t>
       </w:r>
     </w:p>
-    <w:bookmarkStart w:id="12" w:name="a-1109-semana-b"/>
+    <w:bookmarkStart w:id="14" w:name="a-1109-semana-b"/>
     <w:p>
       <w:pPr>
         <w:pStyle w:val="Heading3"/>
@@ -735,7 +889,23 @@
               <w:pStyle w:val="Compact"/>
             </w:pPr>
             <w:r>
-              <w:t xml:space="preserve">Apostila, kits de montagem, fita adesiva, trena/fita métrica e pista de teste</w:t>
+              <w:t xml:space="preserve">Apostila, kits de montagem, fita adesiva, trena/fita métrica,</w:t>
+            </w:r>
+            <w:r>
+              <w:t xml:space="preserve"> </w:t>
+            </w:r>
+            <w:r>
+              <w:rPr>
+                <w:b/>
+                <w:bCs/>
+              </w:rPr>
+              <w:t xml:space="preserve">rolo de papel kraft</w:t>
+            </w:r>
+            <w:r>
+              <w:t xml:space="preserve"> </w:t>
+            </w:r>
+            <w:r>
+              <w:t xml:space="preserve">e pista de teste</w:t>
             </w:r>
           </w:p>
         </w:tc>
@@ -798,8 +968,8 @@
         </w:tc>
       </w:tr>
     </w:tbl>
-    <w:bookmarkEnd w:id="12"/>
-    <w:bookmarkStart w:id="13" w:name="a-1809-semana-a"/>
+    <w:bookmarkEnd w:id="14"/>
+    <w:bookmarkStart w:id="15" w:name="a-1809-semana-a"/>
     <w:p>
       <w:pPr>
         <w:pStyle w:val="Heading3"/>
@@ -1054,7 +1224,23 @@
               <w:pStyle w:val="Compact"/>
             </w:pPr>
             <w:r>
-              <w:t xml:space="preserve">Apostila, Hodômetro iniciado, trena/fita métrica e pista de teste</w:t>
+              <w:t xml:space="preserve">Apostila, Hodômetro iniciado, trena/fita métrica,</w:t>
+            </w:r>
+            <w:r>
+              <w:t xml:space="preserve"> </w:t>
+            </w:r>
+            <w:r>
+              <w:rPr>
+                <w:b/>
+                <w:bCs/>
+              </w:rPr>
+              <w:t xml:space="preserve">rolo de papel kraft</w:t>
+            </w:r>
+            <w:r>
+              <w:t xml:space="preserve"> </w:t>
+            </w:r>
+            <w:r>
+              <w:t xml:space="preserve">e pista de teste</w:t>
             </w:r>
           </w:p>
         </w:tc>
@@ -1117,8 +1303,8 @@
         </w:tc>
       </w:tr>
     </w:tbl>
-    <w:bookmarkEnd w:id="13"/>
-    <w:bookmarkStart w:id="14" w:name="a-2509-semana-b"/>
+    <w:bookmarkEnd w:id="15"/>
+    <w:bookmarkStart w:id="16" w:name="a-2509-semana-b"/>
     <w:p>
       <w:pPr>
         <w:pStyle w:val="Heading3"/>
@@ -1420,8 +1606,8 @@
         </w:tc>
       </w:tr>
     </w:tbl>
-    <w:bookmarkEnd w:id="14"/>
-    <w:bookmarkStart w:id="15" w:name="a-0210-semana-a"/>
+    <w:bookmarkEnd w:id="16"/>
+    <w:bookmarkStart w:id="17" w:name="a-0210-semana-a"/>
     <w:p>
       <w:pPr>
         <w:pStyle w:val="Heading3"/>
@@ -1723,9 +1909,9 @@
         </w:tc>
       </w:tr>
     </w:tbl>
-    <w:bookmarkEnd w:id="15"/>
-    <w:bookmarkEnd w:id="16"/>
-    <w:bookmarkStart w:id="17" w:name="Xf92f86085a8bc323e89ffa2da252eff368ed234"/>
+    <w:bookmarkEnd w:id="17"/>
+    <w:bookmarkEnd w:id="18"/>
+    <w:bookmarkStart w:id="19" w:name="Xf92f86085a8bc323e89ffa2da252eff368ed234"/>
     <w:p>
       <w:pPr>
         <w:pStyle w:val="Heading2"/>
@@ -1790,8 +1976,8 @@
         <w:t xml:space="preserve">. O resumo contém apenas números, sem nomes de estudantes.</w:t>
       </w:r>
     </w:p>
-    <w:bookmarkEnd w:id="17"/>
-    <w:bookmarkEnd w:id="18"/>
+    <w:bookmarkEnd w:id="19"/>
+    <w:bookmarkEnd w:id="20"/>
     <w:sectPr>
       <w:footnotePr>
         <w:numRestart w:val="eachSect"/>

</xml_diff>